<commit_message>
update: docs and README
</commit_message>
<xml_diff>
--- a/docs/GUIDE.docx
+++ b/docs/GUIDE.docx
@@ -8306,6 +8306,58 @@
           <w:szCs w:val="24"/>
         </w:rPr>
         <w:t xml:space="preserve">Được, trong danh sách có sẵn: numpy, pandas, scipy, scikit-learn, xgboost, lightgbm. Không sử dụng model pretrained nặng (PyTorch, TensorFlow). Các thư viện này đã có trong requirements.txt nên chỉ cần pip install một lần.</w:t>
+      </w:r>
+    </w:p>
+    <w:p>
+      <w:pPr>
+        <w:spacing w:after="80" w:before="0"/>
+      </w:pPr>
+      <w:r>
+        <w:t xml:space="preserve"/>
+      </w:r>
+    </w:p>
+    <w:p>
+      <w:pPr>
+        <w:pStyle w:val="Heading2"/>
+        <w:spacing w:after="120" w:before="280"/>
+      </w:pPr>
+      <w:r>
+        <w:rPr>
+          <w:rFonts w:ascii="Times New Roman" w:cs="Times New Roman" w:eastAsia="Times New Roman" w:hAnsi="Times New Roman"/>
+          <w:b/>
+          <w:bCs/>
+          <w:sz w:val="28"/>
+          <w:szCs w:val="28"/>
+        </w:rPr>
+        <w:t xml:space="preserve">8. Lưu ý quan trọng</w:t>
+      </w:r>
+    </w:p>
+    <w:p>
+      <w:pPr>
+        <w:spacing w:after="160" w:before="0"/>
+        <w:jc w:val="both"/>
+      </w:pPr>
+      <w:r>
+        <w:rPr>
+          <w:rFonts w:ascii="Times New Roman" w:cs="Times New Roman" w:eastAsia="Times New Roman" w:hAnsi="Times New Roman"/>
+          <w:sz w:val="24"/>
+          <w:szCs w:val="24"/>
+        </w:rPr>
+        <w:t xml:space="preserve">Challenge này chỉ tổ chức vì mục đích học tập và nghiên cứu — rèn luyện kỹ năng lập trình, mô hình hóa xác suất và phân tích dữ liệu thể thao. Nghiêm cấm mọi hành vi sử dụng challenge, dữ liệu, hay kết quả dự đoán cho mục đích cá cược dưới bất kỳ hình thức nào.</w:t>
+      </w:r>
+    </w:p>
+    <w:p>
+      <w:pPr>
+        <w:spacing w:after="160" w:before="0"/>
+        <w:jc w:val="both"/>
+      </w:pPr>
+      <w:r>
+        <w:rPr>
+          <w:rFonts w:ascii="Times New Roman" w:cs="Times New Roman" w:eastAsia="Times New Roman" w:hAnsi="Times New Roman"/>
+          <w:sz w:val="24"/>
+          <w:szCs w:val="24"/>
+        </w:rPr>
+        <w:t xml:space="preserve">QuantVN miễn trừ mọi trách nhiệm liên quan đến các hành vi cá cược hoặc bất kỳ thiệt hại nào phát sinh từ việc người tham gia sử dụng nội dung challenge sai mục đích. Người tham gia tự chịu trách nhiệm về hành vi của mình.</w:t>
       </w:r>
     </w:p>
     <w:p>

</xml_diff>